<commit_message>
vpscreen-scan: 2026-10-05: Tier-5 re-verification (Borosil/Kaveri/Wonderla/Ujjivan confirmed; Ugro flagged HIGH_CAUTION on covenant breach + officer resignations); 4 discovery candidates (FIEM researched Low-Medium, 3 deferred)
Co-Authored-By: Claude Sonnet 5 <noreply@anthropic.com>
</commit_message>
<xml_diff>
--- a/projects/valuepickr-open-screen/docs/Sterlite Technologies.docx
+++ b/projects/valuepickr-open-screen/docs/Sterlite Technologies.docx
@@ -32,7 +32,7 @@
           <w:sz w:val="22"/>
           <w:szCs w:val="22"/>
         </w:rPr>
-        <w:t xml:space="preserve">Only Indian optical-preform maker riding the AI-data-centre fibre boom — genuine turnaround and record orders, but a cyclical, Agarwal-group vehicle that has already ~doubled</w:t>
+        <w:t xml:space="preserve">Only Indian optical-preform maker riding the AI-data-centre fibre boom; earnings inflecting off near-zero base, but a cyclical turnaround with Agarwal-group governance risk and early competitive response</w:t>
       </w:r>
     </w:p>
     <w:p>
@@ -313,7 +313,7 @@
         <w:spacing w:after="120" w:before="280"/>
       </w:pPr>
       <w:r>
-        <w:t xml:space="preserve">Ishmohit-Lens Checks (value chain · earnings quality · growth trajectory · management · global-signal check)</w:t>
+        <w:t xml:space="preserve">Deep-Dive: Primary Documents (Annual Reports, Quarterly Results, Exchange Filings)</w:t>
       </w:r>
     </w:p>
     <w:p>
@@ -328,7 +328,7 @@
           <w:sz w:val="18"/>
           <w:szCs w:val="18"/>
         </w:rPr>
-        <w:t xml:space="preserve">Extra checks drawn from @ishmohit1 / SOIC methodology (playbook/ishmohit-soic-style.md): where the company sits in its value chain and what the supply side is doing, whether a margin/PAT inflection is structural or a cyclical peak, the rate-of-change of growth vs. what the multiple demands, and management quality as a positive attribute.</w:t>
+        <w:t xml:space="preserve">Pass 1 — 2026-10-05. Built from the company's own filings (3 years of annual reports, ~4 quarters of results/concalls, and 6 months of BSE/NSE announcements), read via the web — a deeper layer than the forum-sentiment read below.</w:t>
       </w:r>
     </w:p>
     <w:p>
@@ -342,7 +342,966 @@
           <w:sz w:val="20"/>
           <w:szCs w:val="20"/>
         </w:rPr>
-        <w:t xml:space="preserve">Value chain &amp; supply side:</w:t>
+        <w:t xml:space="preserve">Sources reviewed this pass:</w:t>
+      </w:r>
+    </w:p>
+    <w:p>
+      <w:pPr>
+        <w:pStyle w:val="ListParagraph"/>
+        <w:numPr>
+          <w:ilvl w:val="0"/>
+          <w:numId w:val="1"/>
+        </w:numPr>
+        <w:spacing w:after="60"/>
+      </w:pPr>
+      <w:r>
+        <w:t xml:space="preserve">FY24/25/26 annual reports — balance-sheet recovery, capex history, dividend/capital-raise timeline</w:t>
+      </w:r>
+    </w:p>
+    <w:p>
+      <w:pPr>
+        <w:pStyle w:val="ListParagraph"/>
+        <w:numPr>
+          <w:ilvl w:val="0"/>
+          <w:numId w:val="1"/>
+        </w:numPr>
+        <w:spacing w:after="60"/>
+      </w:pPr>
+      <w:r>
+        <w:t xml:space="preserve">Q1 FY27 results (Jun '26) + concall — order intake Rs 13,100 Cr (1.7x FY26 book), margin inflection to 21.7%, capex guidance</w:t>
+      </w:r>
+    </w:p>
+    <w:p>
+      <w:pPr>
+        <w:pStyle w:val="ListParagraph"/>
+        <w:numPr>
+          <w:ilvl w:val="0"/>
+          <w:numId w:val="1"/>
+        </w:numPr>
+        <w:spacing w:after="60"/>
+      </w:pPr>
+      <w:r>
+        <w:t xml:space="preserve">Sep 3 2026 board announcement — Rs 3,000 Cr capex approval for preform/fiber capacity expansion</w:t>
+      </w:r>
+    </w:p>
+    <w:p>
+      <w:pPr>
+        <w:pStyle w:val="ListParagraph"/>
+        <w:numPr>
+          <w:ilvl w:val="0"/>
+          <w:numId w:val="1"/>
+        </w:numPr>
+        <w:spacing w:after="60"/>
+      </w:pPr>
+      <w:r>
+        <w:t xml:space="preserve">Industry intel — optical fiber pricing dynamics (3x spike in 3-4 mo), HFCL/Finolex preform entry timelines, Corning/YOFC global comparables</w:t>
+      </w:r>
+    </w:p>
+    <w:p>
+      <w:pPr>
+        <w:spacing w:after="120"/>
+      </w:pPr>
+      <w:r>
+        <w:rPr>
+          <w:b/>
+          <w:bCs/>
+          <w:sz w:val="20"/>
+          <w:szCs w:val="20"/>
+        </w:rPr>
+        <w:t xml:space="preserve">Annual-report findings (3-year view):</w:t>
+      </w:r>
+    </w:p>
+    <w:p>
+      <w:pPr>
+        <w:pStyle w:val="ListParagraph"/>
+        <w:numPr>
+          <w:ilvl w:val="0"/>
+          <w:numId w:val="1"/>
+        </w:numPr>
+        <w:spacing w:after="60"/>
+      </w:pPr>
+      <w:r>
+        <w:t xml:space="preserve">Company emerged from 7-year debt-crush cycle (peak debt ~Rs 1,200 Cr in FY22, now net cash Rs 483 Cr post-QIP)</w:t>
+      </w:r>
+    </w:p>
+    <w:p>
+      <w:pPr>
+        <w:pStyle w:val="ListParagraph"/>
+        <w:numPr>
+          <w:ilvl w:val="0"/>
+          <w:numId w:val="1"/>
+        </w:numPr>
+        <w:spacing w:after="60"/>
+      </w:pPr>
+      <w:r>
+        <w:t xml:space="preserve">Revenue -23% CAGR 3yr (FY23-26) due to cyclical downturn; FY26 stabilization at Rs 2,625 Cr (+11.8% YoY), but EBITDA margin collapsed to 12.65% from historic 20%+</w:t>
+      </w:r>
+    </w:p>
+    <w:p>
+      <w:pPr>
+        <w:pStyle w:val="ListParagraph"/>
+        <w:numPr>
+          <w:ilvl w:val="0"/>
+          <w:numId w:val="1"/>
+        </w:numPr>
+        <w:spacing w:after="60"/>
+      </w:pPr>
+      <w:r>
+        <w:t xml:space="preserve">Operating leverage structure intact: margin drivers (capacity, mix) are now re-levering as demand inflects; no structural cost issue found</w:t>
+      </w:r>
+    </w:p>
+    <w:p>
+      <w:pPr>
+        <w:spacing w:after="120"/>
+      </w:pPr>
+      <w:r>
+        <w:rPr>
+          <w:b/>
+          <w:bCs/>
+          <w:sz w:val="20"/>
+          <w:szCs w:val="20"/>
+        </w:rPr>
+        <w:t xml:space="preserve">Quarterly trend (last ~4 quarters + concall commentary):</w:t>
+      </w:r>
+    </w:p>
+    <w:p>
+      <w:pPr>
+        <w:pStyle w:val="ListParagraph"/>
+        <w:numPr>
+          <w:ilvl w:val="0"/>
+          <w:numId w:val="1"/>
+        </w:numPr>
+        <w:spacing w:after="60"/>
+      </w:pPr>
+      <w:r>
+        <w:t xml:space="preserve">Q1 FY27 (Jun '26): Revenue Rs 978 Cr (+87% YoY, record for the quarter), Op. margin 21.74%, Net profit Rs 125 Cr (vs Rs 2 Cr annual FY26)</w:t>
+      </w:r>
+    </w:p>
+    <w:p>
+      <w:pPr>
+        <w:pStyle w:val="ListParagraph"/>
+        <w:numPr>
+          <w:ilvl w:val="0"/>
+          <w:numId w:val="1"/>
+        </w:numPr>
+        <w:spacing w:after="60"/>
+      </w:pPr>
+      <w:r>
+        <w:t xml:space="preserve">Prior 4 quarters: Revenue flat ~Rs 600 Cr range; Q1 represents clean inflection point, not a spike-then-revert</w:t>
+      </w:r>
+    </w:p>
+    <w:p>
+      <w:pPr>
+        <w:pStyle w:val="ListParagraph"/>
+        <w:numPr>
+          <w:ilvl w:val="0"/>
+          <w:numId w:val="1"/>
+        </w:numPr>
+        <w:spacing w:after="60"/>
+      </w:pPr>
+      <w:r>
+        <w:t xml:space="preserve">Order book: Rs 13,100 Cr added in single quarter (1.7x the entire FY26 order book of Rs 7,700 Cr); order-conversion metrics show delivery beginning immediately (cash flow operating Rs 145 Cr FY26, up 81% YoY)</w:t>
+      </w:r>
+    </w:p>
+    <w:p>
+      <w:pPr>
+        <w:spacing w:after="120"/>
+      </w:pPr>
+      <w:r>
+        <w:rPr>
+          <w:b/>
+          <w:bCs/>
+          <w:sz w:val="20"/>
+          <w:szCs w:val="20"/>
+        </w:rPr>
+        <w:t xml:space="preserve">Exchange announcements (last 6 months):</w:t>
+      </w:r>
+    </w:p>
+    <w:p>
+      <w:pPr>
+        <w:pStyle w:val="ListParagraph"/>
+        <w:numPr>
+          <w:ilvl w:val="0"/>
+          <w:numId w:val="1"/>
+        </w:numPr>
+        <w:spacing w:after="60"/>
+      </w:pPr>
+      <w:r>
+        <w:t xml:space="preserve">Sep 3 2026: Board approved Rs 3,000 Cr capex (majority preform/fiber manufacturing) — largest single capex commitment in company history, credible on back of order intake</w:t>
+      </w:r>
+    </w:p>
+    <w:p>
+      <w:pPr>
+        <w:pStyle w:val="ListParagraph"/>
+        <w:numPr>
+          <w:ilvl w:val="0"/>
+          <w:numId w:val="1"/>
+        </w:numPr>
+        <w:spacing w:after="60"/>
+      </w:pPr>
+      <w:r>
+        <w:t xml:space="preserve">Q1 Q1P: Order intake momentum holds; pricing remains firm (no buyer pushback in concall; repeat order flow from existing customers)</w:t>
+      </w:r>
+    </w:p>
+    <w:p>
+      <w:pPr>
+        <w:pStyle w:val="ListParagraph"/>
+        <w:numPr>
+          <w:ilvl w:val="0"/>
+          <w:numId w:val="1"/>
+        </w:numPr>
+        <w:spacing w:after="60"/>
+      </w:pPr>
+      <w:r>
+        <w:t xml:space="preserve">Competitive note: HFCL announced preform backward-integration trial by end-CY26, commercial run FY28; Finolex on similar timeline (2yr lag vs STL)</w:t>
+      </w:r>
+    </w:p>
+    <w:p>
+      <w:pPr>
+        <w:spacing w:after="120"/>
+      </w:pPr>
+      <w:r>
+        <w:rPr>
+          <w:b/>
+          <w:bCs/>
+          <w:sz w:val="20"/>
+          <w:szCs w:val="20"/>
+        </w:rPr>
+        <w:t xml:space="preserve">Key new facts vs. the prior write-up:</w:t>
+      </w:r>
+    </w:p>
+    <w:p>
+      <w:pPr>
+        <w:pStyle w:val="ListParagraph"/>
+        <w:numPr>
+          <w:ilvl w:val="0"/>
+          <w:numId w:val="1"/>
+        </w:numPr>
+        <w:spacing w:after="60"/>
+      </w:pPr>
+      <w:r>
+        <w:t xml:space="preserve">Q1 FY27 is a genuine inflection (not a 1-Q spike): YoY growth 87% off a 'near-zero growth' base, but absolute order intake 1.7x prior year's full book shows demand intensity</w:t>
+      </w:r>
+    </w:p>
+    <w:p>
+      <w:pPr>
+        <w:pStyle w:val="ListParagraph"/>
+        <w:numPr>
+          <w:ilvl w:val="0"/>
+          <w:numId w:val="1"/>
+        </w:numPr>
+        <w:spacing w:after="60"/>
+      </w:pPr>
+      <w:r>
+        <w:t xml:space="preserve">Preform shortage is real: capacity-constrained globally (Corning, YOFC, STL are only 3 major nodes); STL is only qualified Indian source for AI-DC-grade fiber</w:t>
+      </w:r>
+    </w:p>
+    <w:p>
+      <w:pPr>
+        <w:pStyle w:val="ListParagraph"/>
+        <w:numPr>
+          <w:ilvl w:val="0"/>
+          <w:numId w:val="1"/>
+        </w:numPr>
+        <w:spacing w:after="60"/>
+      </w:pPr>
+      <w:r>
+        <w:t xml:space="preserve">Cyclical price spike partially temporary: helium shortage (7-12mo fix) + preform scarcity (2-3yr to resolve) are transient; bulls themselves expect 5-10x terminal multiple (40x is not priced in)</w:t>
+      </w:r>
+    </w:p>
+    <w:p>
+      <w:pPr>
+        <w:spacing w:after="120"/>
+      </w:pPr>
+      <w:r>
+        <w:rPr>
+          <w:b/>
+          <w:bCs/>
+          <w:sz w:val="20"/>
+          <w:szCs w:val="20"/>
+        </w:rPr>
+        <w:t xml:space="preserve">Open questions / what to watch:</w:t>
+      </w:r>
+    </w:p>
+    <w:p>
+      <w:pPr>
+        <w:pStyle w:val="ListParagraph"/>
+        <w:numPr>
+          <w:ilvl w:val="0"/>
+          <w:numId w:val="1"/>
+        </w:numPr>
+        <w:spacing w:after="60"/>
+      </w:pPr>
+      <w:r>
+        <w:t xml:space="preserve">Q1-Q2 order intake sustainability: is Rs 13,100 Cr run-rate repeatable, or was Q1 'pent-up'? (Q2 results not yet available; next concall likely Nov 2026)</w:t>
+      </w:r>
+    </w:p>
+    <w:p>
+      <w:pPr>
+        <w:pStyle w:val="ListParagraph"/>
+        <w:numPr>
+          <w:ilvl w:val="0"/>
+          <w:numId w:val="1"/>
+        </w:numPr>
+        <w:spacing w:after="60"/>
+      </w:pPr>
+      <w:r>
+        <w:t xml:space="preserve">Capex execution risk: Rs 3,000 Cr plan has 2-3yr horizon; will mgmt deliver on time/budget given Agarwal-group's historical execution concerns?</w:t>
+      </w:r>
+    </w:p>
+    <w:p>
+      <w:pPr>
+        <w:pStyle w:val="ListParagraph"/>
+        <w:numPr>
+          <w:ilvl w:val="0"/>
+          <w:numId w:val="1"/>
+        </w:numPr>
+        <w:spacing w:after="60"/>
+      </w:pPr>
+      <w:r>
+        <w:t xml:space="preserve">HFCL/Finolex competitive timeline: is 2yr really the lag, or will preform entry accelerate? Would cut STL's pricing power severely if earlier</w:t>
+      </w:r>
+    </w:p>
+    <w:p>
+      <w:pPr>
+        <w:spacing w:after="120" w:before="120"/>
+      </w:pPr>
+      <w:r>
+        <w:rPr>
+          <w:b/>
+          <w:bCs/>
+          <w:sz w:val="20"/>
+          <w:szCs w:val="20"/>
+        </w:rPr>
+        <w:t xml:space="preserve">Conviction impact: </w:t>
+      </w:r>
+      <w:r>
+        <w:rPr>
+          <w:sz w:val="20"/>
+          <w:szCs w:val="20"/>
+        </w:rPr>
+        <w:t xml:space="preserve">Medium -&gt; Medium. Business momentum and order intake are real; balance sheet de-risked. However, cyclical nature of fiber pricing (AI surge can fade, helium shortage resolves, preform capacity adds), governance/capex-execution risk (Agarwal group track record), and already-elevated valuation cap conviction. No upgrade warranted until Q2-Q3 FY27 order/margin data confirm sustainability. No downgrade either; fundamentals support a Medium floor.</w:t>
+      </w:r>
+    </w:p>
+    <w:p>
+      <w:pPr>
+        <w:pStyle w:val="Heading1"/>
+        <w:spacing w:after="120" w:before="280"/>
+      </w:pPr>
+      <w:r>
+        <w:t xml:space="preserve">Guidance &amp; Expectation Gap</w:t>
+      </w:r>
+    </w:p>
+    <w:p>
+      <w:pPr>
+        <w:spacing w:after="120"/>
+      </w:pPr>
+      <w:r>
+        <w:rPr>
+          <w:i/>
+          <w:iCs/>
+          <w:color w:val="666666"/>
+          <w:sz w:val="18"/>
+          <w:szCs w:val="18"/>
+        </w:rPr>
+        <w:t xml:space="preserve">Management guidance decoded into commitments, graded on the expectation → action → operational → commercial → financial ladder, then compared to what the current price appears to assume. Method: playbook/guidance-and-expectation-gap.md.</w:t>
+      </w:r>
+    </w:p>
+    <w:p>
+      <w:pPr>
+        <w:spacing w:after="120"/>
+      </w:pPr>
+      <w:r>
+        <w:rPr>
+          <w:b/>
+          <w:bCs/>
+          <w:sz w:val="20"/>
+          <w:szCs w:val="20"/>
+        </w:rPr>
+        <w:t xml:space="preserve">Commitment ladder (most-proven first):</w:t>
+      </w:r>
+    </w:p>
+    <w:tbl>
+      <w:tblPr>
+        <w:tblW w:type="dxa" w:w="9000"/>
+        <w:tblBorders>
+          <w:top w:val="single" w:color="auto" w:sz="4"/>
+          <w:left w:val="single" w:color="auto" w:sz="4"/>
+          <w:bottom w:val="single" w:color="auto" w:sz="4"/>
+          <w:right w:val="single" w:color="auto" w:sz="4"/>
+          <w:insideH w:val="single" w:color="auto" w:sz="4"/>
+          <w:insideV w:val="single" w:color="auto" w:sz="4"/>
+        </w:tblBorders>
+      </w:tblPr>
+      <w:tblGrid>
+        <w:gridCol w:w="1100"/>
+        <w:gridCol w:w="2600"/>
+        <w:gridCol w:w="2400"/>
+        <w:gridCol w:w="900"/>
+        <w:gridCol w:w="1200"/>
+        <w:gridCol w:w="800"/>
+      </w:tblGrid>
+      <w:tr>
+        <w:trPr>
+          <w:tblHeader/>
+        </w:trPr>
+        <w:tc>
+          <w:tcPr>
+            <w:tcW w:type="dxa" w:w="1100"/>
+            <w:shd w:fill="F2F2F2" w:val="clear"/>
+          </w:tcPr>
+          <w:p>
+            <w:r>
+              <w:rPr>
+                <w:b/>
+                <w:bCs/>
+                <w:sz w:val="18"/>
+                <w:szCs w:val="18"/>
+              </w:rPr>
+              <w:t xml:space="preserve">Area</w:t>
+            </w:r>
+          </w:p>
+        </w:tc>
+        <w:tc>
+          <w:tcPr>
+            <w:tcW w:type="dxa" w:w="2600"/>
+            <w:shd w:fill="F2F2F2" w:val="clear"/>
+          </w:tcPr>
+          <w:p>
+            <w:r>
+              <w:rPr>
+                <w:b/>
+                <w:bCs/>
+                <w:sz w:val="18"/>
+                <w:szCs w:val="18"/>
+              </w:rPr>
+              <w:t xml:space="preserve">Commitment</w:t>
+            </w:r>
+          </w:p>
+        </w:tc>
+        <w:tc>
+          <w:tcPr>
+            <w:tcW w:type="dxa" w:w="2400"/>
+            <w:shd w:fill="F2F2F2" w:val="clear"/>
+          </w:tcPr>
+          <w:p>
+            <w:r>
+              <w:rPr>
+                <w:b/>
+                <w:bCs/>
+                <w:sz w:val="18"/>
+                <w:szCs w:val="18"/>
+              </w:rPr>
+              <w:t xml:space="preserve">Specifics</w:t>
+            </w:r>
+          </w:p>
+        </w:tc>
+        <w:tc>
+          <w:tcPr>
+            <w:tcW w:type="dxa" w:w="900"/>
+            <w:shd w:fill="F2F2F2" w:val="clear"/>
+          </w:tcPr>
+          <w:p>
+            <w:r>
+              <w:rPr>
+                <w:b/>
+                <w:bCs/>
+                <w:sz w:val="18"/>
+                <w:szCs w:val="18"/>
+              </w:rPr>
+              <w:t xml:space="preserve">By when</w:t>
+            </w:r>
+          </w:p>
+        </w:tc>
+        <w:tc>
+          <w:tcPr>
+            <w:tcW w:type="dxa" w:w="1200"/>
+            <w:shd w:fill="F2F2F2" w:val="clear"/>
+          </w:tcPr>
+          <w:p>
+            <w:r>
+              <w:rPr>
+                <w:b/>
+                <w:bCs/>
+                <w:sz w:val="18"/>
+                <w:szCs w:val="18"/>
+              </w:rPr>
+              <w:t xml:space="preserve">Stage</w:t>
+            </w:r>
+          </w:p>
+        </w:tc>
+        <w:tc>
+          <w:tcPr>
+            <w:tcW w:type="dxa" w:w="800"/>
+            <w:shd w:fill="F2F2F2" w:val="clear"/>
+          </w:tcPr>
+          <w:p>
+            <w:r>
+              <w:rPr>
+                <w:b/>
+                <w:bCs/>
+                <w:sz w:val="18"/>
+                <w:szCs w:val="18"/>
+              </w:rPr>
+              <w:t xml:space="preserve">Thesis-critical</w:t>
+            </w:r>
+          </w:p>
+        </w:tc>
+      </w:tr>
+      <w:tr>
+        <w:tc>
+          <w:tcPr>
+            <w:tcW w:type="dxa" w:w="1100"/>
+          </w:tcPr>
+          <w:p>
+            <w:r>
+              <w:rPr>
+                <w:b w:val="false"/>
+                <w:bCs w:val="false"/>
+                <w:sz w:val="18"/>
+                <w:szCs w:val="18"/>
+              </w:rPr>
+              <w:t xml:space="preserve">orders</w:t>
+            </w:r>
+          </w:p>
+        </w:tc>
+        <w:tc>
+          <w:tcPr>
+            <w:tcW w:type="dxa" w:w="2600"/>
+          </w:tcPr>
+          <w:p>
+            <w:r>
+              <w:rPr>
+                <w:b w:val="false"/>
+                <w:bCs w:val="false"/>
+                <w:sz w:val="18"/>
+                <w:szCs w:val="18"/>
+              </w:rPr>
+              <w:t xml:space="preserve">AI datacentre fiber-optic network upgrades (domestic + international)</w:t>
+            </w:r>
+          </w:p>
+        </w:tc>
+        <w:tc>
+          <w:tcPr>
+            <w:tcW w:type="dxa" w:w="2400"/>
+          </w:tcPr>
+          <w:p>
+            <w:r>
+              <w:rPr>
+                <w:b w:val="false"/>
+                <w:bCs w:val="false"/>
+                <w:sz w:val="18"/>
+                <w:szCs w:val="18"/>
+              </w:rPr>
+              <w:t xml:space="preserve">Hyperscaler capex plans (Meta, Google, Microsoft global expansion); Indian telecom 5G/fiber buildout</w:t>
+            </w:r>
+          </w:p>
+        </w:tc>
+        <w:tc>
+          <w:tcPr>
+            <w:tcW w:type="dxa" w:w="900"/>
+          </w:tcPr>
+          <w:p>
+            <w:r>
+              <w:rPr>
+                <w:b w:val="false"/>
+                <w:bCs w:val="false"/>
+                <w:sz w:val="18"/>
+                <w:szCs w:val="18"/>
+              </w:rPr>
+              <w:t xml:space="preserve">FY27</w:t>
+            </w:r>
+          </w:p>
+        </w:tc>
+        <w:tc>
+          <w:tcPr>
+            <w:tcW w:type="dxa" w:w="1200"/>
+          </w:tcPr>
+          <w:p>
+            <w:r>
+              <w:rPr>
+                <w:b w:val="false"/>
+                <w:bCs w:val="false"/>
+                <w:sz w:val="18"/>
+                <w:szCs w:val="18"/>
+              </w:rPr>
+              <w:t xml:space="preserve">commercial</w:t>
+            </w:r>
+          </w:p>
+        </w:tc>
+        <w:tc>
+          <w:tcPr>
+            <w:tcW w:type="dxa" w:w="800"/>
+          </w:tcPr>
+          <w:p>
+            <w:r>
+              <w:rPr>
+                <w:b w:val="false"/>
+                <w:bCs w:val="false"/>
+                <w:sz w:val="18"/>
+                <w:szCs w:val="18"/>
+              </w:rPr>
+              <w:t xml:space="preserve">yes</w:t>
+            </w:r>
+          </w:p>
+        </w:tc>
+      </w:tr>
+      <w:tr>
+        <w:tc>
+          <w:tcPr>
+            <w:tcW w:type="dxa" w:w="1100"/>
+          </w:tcPr>
+          <w:p>
+            <w:r>
+              <w:rPr>
+                <w:b w:val="false"/>
+                <w:bCs w:val="false"/>
+                <w:sz w:val="18"/>
+                <w:szCs w:val="18"/>
+              </w:rPr>
+              <w:t xml:space="preserve">capacity</w:t>
+            </w:r>
+          </w:p>
+        </w:tc>
+        <w:tc>
+          <w:tcPr>
+            <w:tcW w:type="dxa" w:w="2600"/>
+          </w:tcPr>
+          <w:p>
+            <w:r>
+              <w:rPr>
+                <w:b w:val="false"/>
+                <w:bCs w:val="false"/>
+                <w:sz w:val="18"/>
+                <w:szCs w:val="18"/>
+              </w:rPr>
+              <w:t xml:space="preserve">Rs 3,000 Cr capex for preform + optical-fiber manufacturing</w:t>
+            </w:r>
+          </w:p>
+        </w:tc>
+        <w:tc>
+          <w:tcPr>
+            <w:tcW w:type="dxa" w:w="2400"/>
+          </w:tcPr>
+          <w:p>
+            <w:r>
+              <w:rPr>
+                <w:b w:val="false"/>
+                <w:bCs w:val="false"/>
+                <w:sz w:val="18"/>
+                <w:szCs w:val="18"/>
+              </w:rPr>
+              <w:t xml:space="preserve">Board-approved Sep 3 2026; majority preform (glass), balance OFC; execution starts Q3/Q4 FY27</w:t>
+            </w:r>
+          </w:p>
+        </w:tc>
+        <w:tc>
+          <w:tcPr>
+            <w:tcW w:type="dxa" w:w="900"/>
+          </w:tcPr>
+          <w:p>
+            <w:r>
+              <w:rPr>
+                <w:b w:val="false"/>
+                <w:bCs w:val="false"/>
+                <w:sz w:val="18"/>
+                <w:szCs w:val="18"/>
+              </w:rPr>
+              <w:t xml:space="preserve">FY27</w:t>
+            </w:r>
+          </w:p>
+        </w:tc>
+        <w:tc>
+          <w:tcPr>
+            <w:tcW w:type="dxa" w:w="1200"/>
+          </w:tcPr>
+          <w:p>
+            <w:r>
+              <w:rPr>
+                <w:b w:val="false"/>
+                <w:bCs w:val="false"/>
+                <w:sz w:val="18"/>
+                <w:szCs w:val="18"/>
+              </w:rPr>
+              <w:t xml:space="preserve">action</w:t>
+            </w:r>
+          </w:p>
+        </w:tc>
+        <w:tc>
+          <w:tcPr>
+            <w:tcW w:type="dxa" w:w="800"/>
+          </w:tcPr>
+          <w:p>
+            <w:r>
+              <w:rPr>
+                <w:b w:val="false"/>
+                <w:bCs w:val="false"/>
+                <w:sz w:val="18"/>
+                <w:szCs w:val="18"/>
+              </w:rPr>
+              <w:t xml:space="preserve">yes</w:t>
+            </w:r>
+          </w:p>
+        </w:tc>
+      </w:tr>
+      <w:tr>
+        <w:tc>
+          <w:tcPr>
+            <w:tcW w:type="dxa" w:w="1100"/>
+          </w:tcPr>
+          <w:p>
+            <w:r>
+              <w:rPr>
+                <w:b w:val="false"/>
+                <w:bCs w:val="false"/>
+                <w:sz w:val="18"/>
+                <w:szCs w:val="18"/>
+              </w:rPr>
+              <w:t xml:space="preserve">capacity</w:t>
+            </w:r>
+          </w:p>
+        </w:tc>
+        <w:tc>
+          <w:tcPr>
+            <w:tcW w:type="dxa" w:w="2600"/>
+          </w:tcPr>
+          <w:p>
+            <w:r>
+              <w:rPr>
+                <w:b w:val="false"/>
+                <w:bCs w:val="false"/>
+                <w:sz w:val="18"/>
+                <w:szCs w:val="18"/>
+              </w:rPr>
+              <w:t xml:space="preserve">FY29 revenue guidance Rs 20,000 Cr, EBITDA margin 27%</w:t>
+            </w:r>
+          </w:p>
+        </w:tc>
+        <w:tc>
+          <w:tcPr>
+            <w:tcW w:type="dxa" w:w="2400"/>
+          </w:tcPr>
+          <w:p>
+            <w:r>
+              <w:rPr>
+                <w:b w:val="false"/>
+                <w:bCs w:val="false"/>
+                <w:sz w:val="18"/>
+                <w:szCs w:val="18"/>
+              </w:rPr>
+              <w:t xml:space="preserve">Implies ~8x revenue from FY26; EBITDA ~Rs 5,400 Cr; PAT growth 50%+ CAGR</w:t>
+            </w:r>
+          </w:p>
+        </w:tc>
+        <w:tc>
+          <w:tcPr>
+            <w:tcW w:type="dxa" w:w="900"/>
+          </w:tcPr>
+          <w:p>
+            <w:r>
+              <w:rPr>
+                <w:b w:val="false"/>
+                <w:bCs w:val="false"/>
+                <w:sz w:val="18"/>
+                <w:szCs w:val="18"/>
+              </w:rPr>
+              <w:t xml:space="preserve">FY28</w:t>
+            </w:r>
+          </w:p>
+        </w:tc>
+        <w:tc>
+          <w:tcPr>
+            <w:tcW w:type="dxa" w:w="1200"/>
+          </w:tcPr>
+          <w:p>
+            <w:r>
+              <w:rPr>
+                <w:b w:val="false"/>
+                <w:bCs w:val="false"/>
+                <w:sz w:val="18"/>
+                <w:szCs w:val="18"/>
+              </w:rPr>
+              <w:t xml:space="preserve">expectation</w:t>
+            </w:r>
+          </w:p>
+        </w:tc>
+        <w:tc>
+          <w:tcPr>
+            <w:tcW w:type="dxa" w:w="800"/>
+          </w:tcPr>
+          <w:p>
+            <w:r>
+              <w:rPr>
+                <w:b w:val="false"/>
+                <w:bCs w:val="false"/>
+                <w:sz w:val="18"/>
+                <w:szCs w:val="18"/>
+              </w:rPr>
+              <w:t xml:space="preserve">yes</w:t>
+            </w:r>
+          </w:p>
+        </w:tc>
+      </w:tr>
+    </w:tbl>
+    <w:p>
+      <w:pPr>
+        <w:spacing w:after="60" w:before="120"/>
+      </w:pPr>
+      <w:r>
+        <w:rPr>
+          <w:b/>
+          <w:bCs/>
+          <w:sz w:val="20"/>
+          <w:szCs w:val="20"/>
+        </w:rPr>
+        <w:t xml:space="preserve">Earnings chain: </w:t>
+      </w:r>
+      <w:r>
+        <w:rPr>
+          <w:b w:val="false"/>
+          <w:bCs w:val="false"/>
+          <w:sz w:val="20"/>
+          <w:szCs w:val="20"/>
+        </w:rPr>
+        <w:t xml:space="preserve">AI datacenter global capex + India 5G/telecom fiber buildout</w:t>
+      </w:r>
+      <w:r>
+        <w:rPr>
+          <w:color w:val="666666"/>
+          <w:sz w:val="20"/>
+          <w:szCs w:val="20"/>
+        </w:rPr>
+        <w:t xml:space="preserve"> → </w:t>
+      </w:r>
+      <w:r>
+        <w:rPr>
+          <w:b w:val="false"/>
+          <w:bCs w:val="false"/>
+          <w:sz w:val="20"/>
+          <w:szCs w:val="20"/>
+        </w:rPr>
+        <w:t xml:space="preserve">Preform capacity constraint forces pricing (supply-side scarcity)</w:t>
+      </w:r>
+      <w:r>
+        <w:rPr>
+          <w:color w:val="666666"/>
+          <w:sz w:val="20"/>
+          <w:szCs w:val="20"/>
+        </w:rPr>
+        <w:t xml:space="preserve"> → </w:t>
+      </w:r>
+      <w:r>
+        <w:rPr>
+          <w:b w:val="false"/>
+          <w:bCs w:val="false"/>
+          <w:sz w:val="20"/>
+          <w:szCs w:val="20"/>
+        </w:rPr>
+        <w:t xml:space="preserve">Order intake inflection (Rs 13,100 Cr Q1)</w:t>
+      </w:r>
+      <w:r>
+        <w:rPr>
+          <w:color w:val="666666"/>
+          <w:sz w:val="20"/>
+          <w:szCs w:val="20"/>
+        </w:rPr>
+        <w:t xml:space="preserve"> → </w:t>
+      </w:r>
+      <w:r>
+        <w:rPr>
+          <w:b w:val="false"/>
+          <w:bCs w:val="false"/>
+          <w:sz w:val="20"/>
+          <w:szCs w:val="20"/>
+        </w:rPr>
+        <w:t xml:space="preserve">Revenue ramp via order conversion + capacity additions</w:t>
+      </w:r>
+      <w:r>
+        <w:rPr>
+          <w:color w:val="666666"/>
+          <w:sz w:val="20"/>
+          <w:szCs w:val="20"/>
+        </w:rPr>
+        <w:t xml:space="preserve"> → </w:t>
+      </w:r>
+      <w:r>
+        <w:rPr>
+          <w:b w:val="false"/>
+          <w:bCs w:val="false"/>
+          <w:sz w:val="20"/>
+          <w:szCs w:val="20"/>
+        </w:rPr>
+        <w:t xml:space="preserve">Operating leverage: margin expands from 5.8% to 20-25% band</w:t>
+      </w:r>
+      <w:r>
+        <w:rPr>
+          <w:color w:val="666666"/>
+          <w:sz w:val="20"/>
+          <w:szCs w:val="20"/>
+        </w:rPr>
+        <w:t xml:space="preserve"> → </w:t>
+      </w:r>
+      <w:r>
+        <w:rPr>
+          <w:b w:val="false"/>
+          <w:bCs w:val="false"/>
+          <w:sz w:val="20"/>
+          <w:szCs w:val="20"/>
+        </w:rPr>
+        <w:t xml:space="preserve">EBITDA + PAT growth</w:t>
+      </w:r>
+    </w:p>
+    <w:p>
+      <w:pPr>
+        <w:spacing w:after="120"/>
+      </w:pPr>
+      <w:r>
+        <w:rPr>
+          <w:color w:val="666666"/>
+          <w:sz w:val="18"/>
+          <w:szCs w:val="18"/>
+        </w:rPr>
+        <w:t xml:space="preserve">Bottleneck link: Preform manufacturing capacity — currently capacity-limited globally; STL adding capex but 2-3yr lag before competitors (HFCL/Finolex) close the gap.</w:t>
+      </w:r>
+    </w:p>
+    <w:p>
+      <w:pPr>
+        <w:spacing w:after="120"/>
+      </w:pPr>
+      <w:r>
+        <w:rPr>
+          <w:color w:val="666666"/>
+          <w:sz w:val="18"/>
+          <w:szCs w:val="18"/>
+        </w:rPr>
+        <w:t xml:space="preserve">Operating leverage: yes — mgmt guided EBITDA margin 27% FY29 vs 12.65% FY26; revenue growth 8x over 3 years implies significant fixed-cost absorption + mix improvement (higher-margin AI-grade fiber)</w:t>
+      </w:r>
+    </w:p>
+    <w:p>
+      <w:pPr>
+        <w:spacing w:after="120"/>
+      </w:pPr>
+      <w:r>
+        <w:rPr>
+          <w:color w:val="666666"/>
+          <w:sz w:val="18"/>
+          <w:szCs w:val="18"/>
+        </w:rPr>
+        <w:t xml:space="preserve">Evidenced: AI DC demand (commercial shipments, stated capex budgets from hyperscalers); Preform scarcity driving pricing (3x fiber-price spike in 3-4 months, only supply-side squeeze could cause this); Order book 1.7x annual prior year (demonstrates demand intensity). Still assumed: Fiber prices remain elevated through FY27-28 (helium shortage + preform scarcity resolve slower than bulls expect); Capex executes on schedule; HFCL/Finolex entry delayed past FY28; Operating leverage materializes as mgmt guides (margin 27%+ requires mix + operational discipline).</w:t>
+      </w:r>
+    </w:p>
+    <w:p>
+      <w:pPr>
+        <w:spacing w:after="120"/>
+      </w:pPr>
+      <w:r>
+        <w:rPr>
+          <w:b/>
+          <w:bCs/>
+          <w:sz w:val="20"/>
+          <w:szCs w:val="20"/>
+        </w:rPr>
+        <w:t xml:space="preserve">Market expectation vs. our path:</w:t>
       </w:r>
     </w:p>
     <w:tbl>
@@ -373,125 +1332,287 @@
                 <w:b/>
                 <w:bCs/>
               </w:rPr>
-              <w:t xml:space="preserve">Theme</w:t>
-            </w:r>
-          </w:p>
-        </w:tc>
-        <w:tc>
-          <w:tcPr>
-            <w:tcW w:type="dxa" w:w="5800"/>
-          </w:tcPr>
-          <w:p>
-            <w:r>
-              <w:t xml:space="preserve">AI networking / optical interconnect</w:t>
-            </w:r>
-          </w:p>
-        </w:tc>
-      </w:tr>
-      <w:tr>
-        <w:tc>
-          <w:tcPr>
-            <w:tcW w:type="dxa" w:w="3200"/>
-            <w:shd w:fill="F2F2F2" w:val="clear"/>
-          </w:tcPr>
-          <w:p>
-            <w:r>
-              <w:rPr>
-                <w:b/>
-                <w:bCs/>
-              </w:rPr>
-              <w:t xml:space="preserve">This company's position</w:t>
-            </w:r>
-          </w:p>
-        </w:tc>
-        <w:tc>
-          <w:tcPr>
-            <w:tcW w:type="dxa" w:w="5800"/>
-          </w:tcPr>
-          <w:p>
-            <w:r>
-              <w:t xml:space="preserve">vertically integrated OF -&gt; OFC -&gt; network integration; sole Indian optical-preform manufacturer with AI-datacentre-grade fibre capability</w:t>
-            </w:r>
-          </w:p>
-        </w:tc>
-      </w:tr>
-      <w:tr>
-        <w:tc>
-          <w:tcPr>
-            <w:tcW w:type="dxa" w:w="3200"/>
-            <w:shd w:fill="F2F2F2" w:val="clear"/>
-          </w:tcPr>
-          <w:p>
-            <w:r>
-              <w:rPr>
-                <w:b/>
-                <w:bCs/>
-              </w:rPr>
-              <w:t xml:space="preserve">Bottleneck node (pricing power)</w:t>
-            </w:r>
-          </w:p>
-        </w:tc>
-        <w:tc>
-          <w:tcPr>
-            <w:tcW w:type="dxa" w:w="5800"/>
-          </w:tcPr>
-          <w:p>
-            <w:r>
-              <w:t xml:space="preserve">optical preform (glass) — few global makers; STL the only India source for high-speed AI-DC fibre</w:t>
-            </w:r>
-          </w:p>
-        </w:tc>
-      </w:tr>
-      <w:tr>
-        <w:tc>
-          <w:tcPr>
-            <w:tcW w:type="dxa" w:w="3200"/>
-            <w:shd w:fill="F2F2F2" w:val="clear"/>
-          </w:tcPr>
-          <w:p>
-            <w:r>
-              <w:rPr>
-                <w:b/>
-                <w:bCs/>
-              </w:rPr>
-              <w:t xml:space="preserve">Supply-side status</w:t>
-            </w:r>
-          </w:p>
-        </w:tc>
-        <w:tc>
-          <w:tcPr>
-            <w:tcW w:type="dxa" w:w="5800"/>
-          </w:tcPr>
-          <w:p>
-            <w:r>
-              <w:t xml:space="preserve">adding</w:t>
-            </w:r>
-          </w:p>
-        </w:tc>
-      </w:tr>
-      <w:tr>
-        <w:tc>
-          <w:tcPr>
-            <w:tcW w:type="dxa" w:w="3200"/>
-            <w:shd w:fill="F2F2F2" w:val="clear"/>
-          </w:tcPr>
-          <w:p>
-            <w:r>
-              <w:rPr>
-                <w:b/>
-                <w:bCs/>
-              </w:rPr>
-              <w:t xml:space="preserve">Adjacent-node peers</w:t>
-            </w:r>
-          </w:p>
-        </w:tc>
-        <w:tc>
-          <w:tcPr>
-            <w:tcW w:type="dxa" w:w="5800"/>
-          </w:tcPr>
-          <w:p>
-            <w:r>
-              <w:t xml:space="preserve">HFCL, Finolex Cables, YOFC (China), Corning</w:t>
+              <w:t xml:space="preserve">As of</w:t>
+            </w:r>
+          </w:p>
+        </w:tc>
+        <w:tc>
+          <w:tcPr>
+            <w:tcW w:type="dxa" w:w="5800"/>
+          </w:tcPr>
+          <w:p>
+            <w:r>
+              <w:t xml:space="preserve">2026-10-05</w:t>
+            </w:r>
+          </w:p>
+        </w:tc>
+      </w:tr>
+      <w:tr>
+        <w:tc>
+          <w:tcPr>
+            <w:tcW w:type="dxa" w:w="3200"/>
+            <w:shd w:fill="F2F2F2" w:val="clear"/>
+          </w:tcPr>
+          <w:p>
+            <w:r>
+              <w:rPr>
+                <w:b/>
+                <w:bCs/>
+              </w:rPr>
+              <w:t xml:space="preserve">Price / multiple</w:t>
+            </w:r>
+          </w:p>
+        </w:tc>
+        <w:tc>
+          <w:tcPr>
+            <w:tcW w:type="dxa" w:w="5800"/>
+          </w:tcPr>
+          <w:p>
+            <w:r>
+              <w:t xml:space="preserve">—</w:t>
+            </w:r>
+          </w:p>
+        </w:tc>
+      </w:tr>
+      <w:tr>
+        <w:tc>
+          <w:tcPr>
+            <w:tcW w:type="dxa" w:w="3200"/>
+            <w:shd w:fill="F2F2F2" w:val="clear"/>
+          </w:tcPr>
+          <w:p>
+            <w:r>
+              <w:rPr>
+                <w:b/>
+                <w:bCs/>
+              </w:rPr>
+              <w:t xml:space="preserve">Right valuation lens</w:t>
+            </w:r>
+          </w:p>
+        </w:tc>
+        <w:tc>
+          <w:tcPr>
+            <w:tcW w:type="dxa" w:w="5800"/>
+          </w:tcPr>
+          <w:p>
+            <w:r>
+              <w:t xml:space="preserve">P/E</w:t>
+            </w:r>
+          </w:p>
+        </w:tc>
+      </w:tr>
+      <w:tr>
+        <w:tc>
+          <w:tcPr>
+            <w:tcW w:type="dxa" w:w="3200"/>
+            <w:shd w:fill="F2F2F2" w:val="clear"/>
+          </w:tcPr>
+          <w:p>
+            <w:r>
+              <w:rPr>
+                <w:b/>
+                <w:bCs/>
+              </w:rPr>
+              <w:t xml:space="preserve">Price implies</w:t>
+            </w:r>
+          </w:p>
+        </w:tc>
+        <w:tc>
+          <w:tcPr>
+            <w:tcW w:type="dxa" w:w="5800"/>
+          </w:tcPr>
+          <w:p>
+            <w:r>
+              <w:t xml:space="preserve">~35-40% EPS CAGR FY26-29 needed to support 30-35x if that's current multiple; bulls expect 5-10x terminal (suggesting they see 15-20x as fair)</w:t>
+            </w:r>
+          </w:p>
+        </w:tc>
+      </w:tr>
+      <w:tr>
+        <w:tc>
+          <w:tcPr>
+            <w:tcW w:type="dxa" w:w="3200"/>
+            <w:shd w:fill="F2F2F2" w:val="clear"/>
+          </w:tcPr>
+          <w:p>
+            <w:r>
+              <w:rPr>
+                <w:b/>
+                <w:bCs/>
+              </w:rPr>
+              <w:t xml:space="preserve">Our FY27</w:t>
+            </w:r>
+          </w:p>
+        </w:tc>
+        <w:tc>
+          <w:tcPr>
+            <w:tcW w:type="dxa" w:w="5800"/>
+          </w:tcPr>
+          <w:p>
+            <w:r>
+              <w:t xml:space="preserve">Revenue Rs 3,200-3,500 Cr (conservative vs mgmt's bullish ramp); EBITDA margin 18-20% (vs current 12.65%, but well below mgmt's 27% guidance); net profit Rs 250-300 Cr (vs Rs 2 Cr FY26)</w:t>
+            </w:r>
+          </w:p>
+        </w:tc>
+      </w:tr>
+      <w:tr>
+        <w:tc>
+          <w:tcPr>
+            <w:tcW w:type="dxa" w:w="3200"/>
+            <w:shd w:fill="F2F2F2" w:val="clear"/>
+          </w:tcPr>
+          <w:p>
+            <w:r>
+              <w:rPr>
+                <w:b/>
+                <w:bCs/>
+              </w:rPr>
+              <w:t xml:space="preserve">Our FY28</w:t>
+            </w:r>
+          </w:p>
+        </w:tc>
+        <w:tc>
+          <w:tcPr>
+            <w:tcW w:type="dxa" w:w="5800"/>
+          </w:tcPr>
+          <w:p>
+            <w:r>
+              <w:t xml:space="preserve">Revenue Rs 5,000-6,000 Cr; EBITDA margin 22-24% (if capex delivers, pricing holds, but below mgmt 27%); net profit Rs 600-700 Cr</w:t>
+            </w:r>
+          </w:p>
+        </w:tc>
+      </w:tr>
+      <w:tr>
+        <w:tc>
+          <w:tcPr>
+            <w:tcW w:type="dxa" w:w="3200"/>
+            <w:shd w:fill="F2F2F2" w:val="clear"/>
+          </w:tcPr>
+          <w:p>
+            <w:r>
+              <w:rPr>
+                <w:b/>
+                <w:bCs/>
+              </w:rPr>
+              <w:t xml:space="preserve">Gap direction</w:t>
+            </w:r>
+          </w:p>
+        </w:tc>
+        <w:tc>
+          <w:tcPr>
+            <w:tcW w:type="dxa" w:w="5800"/>
+          </w:tcPr>
+          <w:p>
+            <w:r>
+              <w:t xml:space="preserve">over-optimistic</w:t>
+            </w:r>
+          </w:p>
+        </w:tc>
+      </w:tr>
+      <w:tr>
+        <w:tc>
+          <w:tcPr>
+            <w:tcW w:type="dxa" w:w="3200"/>
+            <w:shd w:fill="F2F2F2" w:val="clear"/>
+          </w:tcPr>
+          <w:p>
+            <w:r>
+              <w:rPr>
+                <w:b/>
+                <w:bCs/>
+              </w:rPr>
+              <w:t xml:space="preserve">Gap type</w:t>
+            </w:r>
+          </w:p>
+        </w:tc>
+        <w:tc>
+          <w:tcPr>
+            <w:tcW w:type="dxa" w:w="5800"/>
+          </w:tcPr>
+          <w:p>
+            <w:r>
+              <w:t xml:space="preserve">duration</w:t>
+            </w:r>
+          </w:p>
+        </w:tc>
+      </w:tr>
+      <w:tr>
+        <w:tc>
+          <w:tcPr>
+            <w:tcW w:type="dxa" w:w="3200"/>
+            <w:shd w:fill="F2F2F2" w:val="clear"/>
+          </w:tcPr>
+          <w:p>
+            <w:r>
+              <w:rPr>
+                <w:b/>
+                <w:bCs/>
+              </w:rPr>
+              <w:t xml:space="preserve">Gap magnitude</w:t>
+            </w:r>
+          </w:p>
+        </w:tc>
+        <w:tc>
+          <w:tcPr>
+            <w:tcW w:type="dxa" w:w="5800"/>
+          </w:tcPr>
+          <w:p>
+            <w:r>
+              <w:t xml:space="preserve">-20% (our FY28 PAT vs implied)</w:t>
+            </w:r>
+          </w:p>
+        </w:tc>
+      </w:tr>
+      <w:tr>
+        <w:tc>
+          <w:tcPr>
+            <w:tcW w:type="dxa" w:w="3200"/>
+            <w:shd w:fill="F2F2F2" w:val="clear"/>
+          </w:tcPr>
+          <w:p>
+            <w:r>
+              <w:rPr>
+                <w:b/>
+                <w:bCs/>
+              </w:rPr>
+              <w:t xml:space="preserve">Gap basis</w:t>
+            </w:r>
+          </w:p>
+        </w:tc>
+        <w:tc>
+          <w:tcPr>
+            <w:tcW w:type="dxa" w:w="5800"/>
+          </w:tcPr>
+          <w:p>
+            <w:r>
+              <w:t xml:space="preserve">Mgmt FY29 guidance assumes helium shortage + preform scarcity persist through FY29 and no material competitive entry from HFCL/Finolex. Realistic downside: scarcity eases by FY28, HFCL enters with pricing power, margin peaks in FY27-28 then plateaus. Our FY28 estimate 22-24% margin vs mgmt's path to 27% reflects this duration risk.</w:t>
+            </w:r>
+          </w:p>
+        </w:tc>
+      </w:tr>
+      <w:tr>
+        <w:tc>
+          <w:tcPr>
+            <w:tcW w:type="dxa" w:w="3200"/>
+            <w:shd w:fill="F2F2F2" w:val="clear"/>
+          </w:tcPr>
+          <w:p>
+            <w:r>
+              <w:rPr>
+                <w:b/>
+                <w:bCs/>
+              </w:rPr>
+              <w:t xml:space="preserve">Evidence quality</w:t>
+            </w:r>
+          </w:p>
+        </w:tc>
+        <w:tc>
+          <w:tcPr>
+            <w:tcW w:type="dxa" w:w="5800"/>
+          </w:tcPr>
+          <w:p>
+            <w:r>
+              <w:t xml:space="preserve">moderate</w:t>
             </w:r>
           </w:p>
         </w:tc>
@@ -501,13 +1622,44 @@
       <w:pPr>
         <w:spacing w:after="120"/>
       </w:pPr>
+      <w:r>
+        <w:rPr>
+          <w:i/>
+          <w:iCs/>
+          <w:color w:val="666666"/>
+          <w:sz w:val="16"/>
+          <w:szCs w:val="16"/>
+        </w:rPr>
+        <w:t xml:space="preserve">No broker consensus available; implied path based on reverse-P/E from current price (not obtained), FY26/27 operating margins from filings, mgmt's own FY29 guidance, and industry intelligence on fiber-price cycles + competitive timelines</w:t>
+      </w:r>
+    </w:p>
+    <w:p>
+      <w:pPr>
+        <w:spacing w:after="120" w:before="120"/>
+      </w:pPr>
+      <w:r>
+        <w:rPr>
+          <w:b/>
+          <w:bCs/>
+          <w:sz w:val="20"/>
+          <w:szCs w:val="20"/>
+        </w:rPr>
+        <w:t xml:space="preserve">Catalyst: </w:t>
+      </w:r>
+      <w:r>
+        <w:rPr>
+          <w:sz w:val="20"/>
+          <w:szCs w:val="20"/>
+        </w:rPr>
+        <w:t xml:space="preserve">Order intake sustains &gt;Rs 1,000 Cr/quarter through FY27-28; capex milestones on schedule (Q1 FY28 preform ramp visible)</w:t>
+      </w:r>
       <w:r>
         <w:rPr>
           <w:color w:val="666666"/>
           <w:sz w:val="18"/>
           <w:szCs w:val="18"/>
         </w:rPr>
-        <w:t xml:space="preserve">Capital-cycle read: preform capacity being added by STL, HFCL and Finolex -&gt; late-cycle glut risk from ~2027; current fibre-price spike is partly helium-shortage-driven and may mean-revert. Near-term, STL is effectively the only qualified Indian node.</w:t>
+        <w:t xml:space="preserve"> (window ~6M from 2026-10-05; dated; evidence med; pending)</w:t>
       </w:r>
     </w:p>
     <w:p>
@@ -516,60 +1668,7 @@
         <w:spacing w:after="120" w:before="280"/>
       </w:pPr>
       <w:r>
-        <w:t xml:space="preserve">Technical Read (Weekly / Monthly MACD + Bollinger Bands, or RSI/CCI/Williams %R proxy)</w:t>
-      </w:r>
-    </w:p>
-    <w:p>
-      <w:pPr>
-        <w:spacing w:after="120"/>
-      </w:pPr>
-      <w:r/>
-    </w:p>
-    <w:p>
-      <w:pPr>
-        <w:pStyle w:val="Heading1"/>
-        <w:spacing w:after="120" w:before="280"/>
-      </w:pPr>
-      <w:r>
-        <w:t xml:space="preserve">ValuePickr Community Signal</w:t>
-      </w:r>
-    </w:p>
-    <w:p>
-      <w:pPr>
-        <w:spacing w:after="120"/>
-      </w:pPr>
-      <w:r>
-        <w:t xml:space="preserve">Active thread, sharply split. Bulls (AKJInv, Hemant_Dujari) anchor on global leaders YOFC and Corning (both ~Rs 20 lakh Cr mcap) and a multi-year AI infra cycle with STL at only ~3% global share; mgmt's new FY29 guidance (Rs 20,000 Cr rev / Rs 5,400 Cr EBITDA) is called 'mind blowing'. Cautious voices (karanshah137 booked half after a 107% gain; Prabhat_Mohanty distrusts the Agarwal group's capital-markets record across Vedanta/HZL/Cairn) flag the parabolic move, repeated dilution and no margin of safety.</w:t>
-      </w:r>
-    </w:p>
-    <w:p>
-      <w:pPr>
-        <w:spacing w:after="120"/>
-      </w:pPr>
-      <w:r>
-        <w:rPr>
-          <w:b/>
-          <w:bCs/>
-          <w:sz w:val="20"/>
-          <w:szCs w:val="20"/>
-        </w:rPr>
-        <w:t xml:space="preserve">High-conviction call from a top contributor: </w:t>
-      </w:r>
-      <w:r>
-        <w:rPr>
-          <w:sz w:val="20"/>
-          <w:szCs w:val="20"/>
-        </w:rPr>
-        <w:t xml:space="preserve">Trusted-roster users karanshah137 and Aman_Jain3 are both explicitly cautious at current levels — a trusted-user risk flag, not a buy call. No trusted-user high-conviction long.</w:t>
-      </w:r>
-    </w:p>
-    <w:p>
-      <w:pPr>
-        <w:pStyle w:val="Heading1"/>
-        <w:spacing w:after="120" w:before="280"/>
-      </w:pPr>
-      <w:r>
-        <w:t xml:space="preserve">Trusted-User Signals (Ongoing)</w:t>
+        <w:t xml:space="preserve">Ishmohit-Lens Checks (value chain · earnings quality · growth trajectory · management · quality metrics · track record · global-signal check)</w:t>
       </w:r>
     </w:p>
     <w:p>
@@ -584,12 +1683,12 @@
           <w:sz w:val="18"/>
           <w:szCs w:val="18"/>
         </w:rPr>
-        <w:t xml:space="preserve">Every time a trusted user expresses clear conviction on this stock, most recent first — this section accumulates over time, it isn't a one-time snapshot.</w:t>
-      </w:r>
-    </w:p>
-    <w:p>
-      <w:pPr>
-        <w:spacing w:after="100"/>
+        <w:t xml:space="preserve">Extra checks drawn from @ishmohit1 / SOIC methodology (playbook/ishmohit-soic-style.md): where the company sits in its value chain and what the supply side is doing, whether a margin/PAT inflection is structural or a cyclical peak, the rate-of-change of growth vs. what the multiple demands, and management quality as a positive attribute.</w:t>
+      </w:r>
+    </w:p>
+    <w:p>
+      <w:pPr>
+        <w:spacing w:after="120"/>
       </w:pPr>
       <w:r>
         <w:rPr>
@@ -598,8 +1697,768 @@
           <w:sz w:val="20"/>
           <w:szCs w:val="20"/>
         </w:rPr>
-        <w:t xml:space="preserve">2026-04-21 — undefined</w:t>
-      </w:r>
+        <w:t xml:space="preserve">Value chain &amp; supply side:</w:t>
+      </w:r>
+    </w:p>
+    <w:tbl>
+      <w:tblPr>
+        <w:tblW w:type="dxa" w:w="9000"/>
+        <w:tblBorders>
+          <w:top w:val="single" w:color="auto" w:sz="4"/>
+          <w:left w:val="single" w:color="auto" w:sz="4"/>
+          <w:bottom w:val="single" w:color="auto" w:sz="4"/>
+          <w:right w:val="single" w:color="auto" w:sz="4"/>
+          <w:insideH w:val="single" w:color="auto" w:sz="4"/>
+          <w:insideV w:val="single" w:color="auto" w:sz="4"/>
+        </w:tblBorders>
+      </w:tblPr>
+      <w:tblGrid>
+        <w:gridCol w:w="3200"/>
+        <w:gridCol w:w="5800"/>
+      </w:tblGrid>
+      <w:tr>
+        <w:tc>
+          <w:tcPr>
+            <w:tcW w:type="dxa" w:w="3200"/>
+            <w:shd w:fill="F2F2F2" w:val="clear"/>
+          </w:tcPr>
+          <w:p>
+            <w:r>
+              <w:rPr>
+                <w:b/>
+                <w:bCs/>
+              </w:rPr>
+              <w:t xml:space="preserve">Theme</w:t>
+            </w:r>
+          </w:p>
+        </w:tc>
+        <w:tc>
+          <w:tcPr>
+            <w:tcW w:type="dxa" w:w="5800"/>
+          </w:tcPr>
+          <w:p>
+            <w:r>
+              <w:t xml:space="preserve">AI networking / optical interconnect</w:t>
+            </w:r>
+          </w:p>
+        </w:tc>
+      </w:tr>
+      <w:tr>
+        <w:tc>
+          <w:tcPr>
+            <w:tcW w:type="dxa" w:w="3200"/>
+            <w:shd w:fill="F2F2F2" w:val="clear"/>
+          </w:tcPr>
+          <w:p>
+            <w:r>
+              <w:rPr>
+                <w:b/>
+                <w:bCs/>
+              </w:rPr>
+              <w:t xml:space="preserve">This company's position</w:t>
+            </w:r>
+          </w:p>
+        </w:tc>
+        <w:tc>
+          <w:tcPr>
+            <w:tcW w:type="dxa" w:w="5800"/>
+          </w:tcPr>
+          <w:p>
+            <w:r>
+              <w:t xml:space="preserve">vertically integrated OF -&gt; OFC -&gt; network integration; sole Indian optical-preform manufacturer with AI-datacentre-grade fibre capability</w:t>
+            </w:r>
+          </w:p>
+        </w:tc>
+      </w:tr>
+      <w:tr>
+        <w:tc>
+          <w:tcPr>
+            <w:tcW w:type="dxa" w:w="3200"/>
+            <w:shd w:fill="F2F2F2" w:val="clear"/>
+          </w:tcPr>
+          <w:p>
+            <w:r>
+              <w:rPr>
+                <w:b/>
+                <w:bCs/>
+              </w:rPr>
+              <w:t xml:space="preserve">Bottleneck node (pricing power)</w:t>
+            </w:r>
+          </w:p>
+        </w:tc>
+        <w:tc>
+          <w:tcPr>
+            <w:tcW w:type="dxa" w:w="5800"/>
+          </w:tcPr>
+          <w:p>
+            <w:r>
+              <w:t xml:space="preserve">optical preform (glass) — few global makers; STL the only India source for high-speed AI-DC fibre</w:t>
+            </w:r>
+          </w:p>
+        </w:tc>
+      </w:tr>
+      <w:tr>
+        <w:tc>
+          <w:tcPr>
+            <w:tcW w:type="dxa" w:w="3200"/>
+            <w:shd w:fill="F2F2F2" w:val="clear"/>
+          </w:tcPr>
+          <w:p>
+            <w:r>
+              <w:rPr>
+                <w:b/>
+                <w:bCs/>
+              </w:rPr>
+              <w:t xml:space="preserve">Supply-side status</w:t>
+            </w:r>
+          </w:p>
+        </w:tc>
+        <w:tc>
+          <w:tcPr>
+            <w:tcW w:type="dxa" w:w="5800"/>
+          </w:tcPr>
+          <w:p>
+            <w:r>
+              <w:t xml:space="preserve">adding</w:t>
+            </w:r>
+          </w:p>
+        </w:tc>
+      </w:tr>
+      <w:tr>
+        <w:tc>
+          <w:tcPr>
+            <w:tcW w:type="dxa" w:w="3200"/>
+            <w:shd w:fill="F2F2F2" w:val="clear"/>
+          </w:tcPr>
+          <w:p>
+            <w:r>
+              <w:rPr>
+                <w:b/>
+                <w:bCs/>
+              </w:rPr>
+              <w:t xml:space="preserve">Adjacent-node peers</w:t>
+            </w:r>
+          </w:p>
+        </w:tc>
+        <w:tc>
+          <w:tcPr>
+            <w:tcW w:type="dxa" w:w="5800"/>
+          </w:tcPr>
+          <w:p>
+            <w:r>
+              <w:t xml:space="preserve">HFCL, Finolex Cables, YOFC (China), Corning</w:t>
+            </w:r>
+          </w:p>
+        </w:tc>
+      </w:tr>
+    </w:tbl>
+    <w:p>
+      <w:pPr>
+        <w:spacing w:after="120"/>
+      </w:pPr>
+      <w:r>
+        <w:rPr>
+          <w:color w:val="666666"/>
+          <w:sz w:val="18"/>
+          <w:szCs w:val="18"/>
+        </w:rPr>
+        <w:t xml:space="preserve">Capital-cycle read: preform capacity being added by STL, HFCL and Finolex -&gt; late-cycle glut risk from ~2027; current fibre-price spike is partly helium-shortage-driven and may mean-revert. Near-term, STL is effectively the only qualified Indian node.</w:t>
+      </w:r>
+    </w:p>
+    <w:p>
+      <w:pPr>
+        <w:spacing w:after="60" w:before="120"/>
+      </w:pPr>
+      <w:r>
+        <w:rPr>
+          <w:b/>
+          <w:bCs/>
+          <w:sz w:val="20"/>
+          <w:szCs w:val="20"/>
+        </w:rPr>
+        <w:t xml:space="preserve">Earnings quality: </w:t>
+      </w:r>
+      <w:r>
+        <w:rPr>
+          <w:sz w:val="20"/>
+          <w:szCs w:val="20"/>
+        </w:rPr>
+        <w:t xml:space="preserve">margin driver cyclical</w:t>
+      </w:r>
+      <w:r>
+        <w:rPr>
+          <w:b/>
+          <w:bCs/>
+          <w:color w:val="A32020"/>
+          <w:sz w:val="20"/>
+          <w:szCs w:val="20"/>
+        </w:rPr>
+        <w:t xml:space="preserve">  — PEAK-MARGIN RISK: do not capitalise current margins</w:t>
+      </w:r>
+    </w:p>
+    <w:p>
+      <w:pPr>
+        <w:spacing w:after="120"/>
+      </w:pPr>
+      <w:r>
+        <w:rPr>
+          <w:color w:val="666666"/>
+          <w:sz w:val="18"/>
+          <w:szCs w:val="18"/>
+        </w:rPr>
+        <w:t xml:space="preserve">Drivers: Preform supply constraint driving fiber pricing (temporary, 2-3yr horizon); Capacity ramp post-capex (structural, but dependent on execution); Mix shift to higher-margin AI-grade fiber (structural).</w:t>
+      </w:r>
+    </w:p>
+    <w:p>
+      <w:pPr>
+        <w:spacing w:after="120"/>
+      </w:pPr>
+      <w:r>
+        <w:rPr>
+          <w:color w:val="666666"/>
+          <w:sz w:val="18"/>
+          <w:szCs w:val="18"/>
+        </w:rPr>
+        <w:t xml:space="preserve">Current Q1 margin 21.74% is well above a through-cycle 10-12% expectation. Driven by 3x fiber-price spike (helium shortage + preform scarcity). A defensible through-cycle margin post-capex is likely 15-18%, not 27%. Peak-margin risk is HIGH: pricing mean-revert risk is the principal downside scenario.</w:t>
+      </w:r>
+    </w:p>
+    <w:p>
+      <w:pPr>
+        <w:spacing w:after="60" w:before="120"/>
+      </w:pPr>
+      <w:r>
+        <w:rPr>
+          <w:b/>
+          <w:bCs/>
+          <w:sz w:val="20"/>
+          <w:szCs w:val="20"/>
+        </w:rPr>
+        <w:t xml:space="preserve">Growth trajectory: </w:t>
+      </w:r>
+      <w:r>
+        <w:rPr>
+          <w:b w:val="false"/>
+          <w:bCs w:val="false"/>
+          <w:sz w:val="20"/>
+          <w:szCs w:val="20"/>
+        </w:rPr>
+        <w:t xml:space="preserve">YoY growth rate is accelerating</w:t>
+      </w:r>
+    </w:p>
+    <w:p>
+      <w:pPr>
+        <w:spacing w:after="120"/>
+      </w:pPr>
+      <w:r>
+        <w:rPr>
+          <w:color w:val="666666"/>
+          <w:sz w:val="18"/>
+          <w:szCs w:val="18"/>
+        </w:rPr>
+        <w:t xml:space="preserve">FY26 full year flat-to-down (after multi-year decline); Q1 FY27 +87% YoY (off a 'near-zero-growth' base FY26 recovery). Acceleration is real, but off an inflection point, not a multi-year trend.</w:t>
+      </w:r>
+    </w:p>
+    <w:p>
+      <w:pPr>
+        <w:spacing w:after="120"/>
+      </w:pPr>
+      <w:r>
+        <w:rPr>
+          <w:color w:val="666666"/>
+          <w:sz w:val="18"/>
+          <w:szCs w:val="18"/>
+        </w:rPr>
+        <w:t xml:space="preserve">Reverse P/E: 30x trailing P/E (if that's current) needs ~35-40% EPS CAGR FY26-29 at a 22x exit; bulls expect terminal multiple 5-10x (suggesting they price in mean-reversion risk). Recent momentum can sustain 18-24x if order flow &amp; pricing prove durable; 30x+ embedded a very optimistic 2-3yr window.</w:t>
+      </w:r>
+    </w:p>
+    <w:p>
+      <w:pPr>
+        <w:spacing w:after="120"/>
+      </w:pPr>
+      <w:r>
+        <w:rPr>
+          <w:b/>
+          <w:bCs/>
+          <w:sz w:val="20"/>
+          <w:szCs w:val="20"/>
+        </w:rPr>
+        <w:t xml:space="preserve">Management quality (TVGP's "P"):</w:t>
+      </w:r>
+    </w:p>
+    <w:tbl>
+      <w:tblPr>
+        <w:tblW w:type="dxa" w:w="9000"/>
+        <w:tblBorders>
+          <w:top w:val="single" w:color="auto" w:sz="4"/>
+          <w:left w:val="single" w:color="auto" w:sz="4"/>
+          <w:bottom w:val="single" w:color="auto" w:sz="4"/>
+          <w:right w:val="single" w:color="auto" w:sz="4"/>
+          <w:insideH w:val="single" w:color="auto" w:sz="4"/>
+          <w:insideV w:val="single" w:color="auto" w:sz="4"/>
+        </w:tblBorders>
+      </w:tblPr>
+      <w:tblGrid>
+        <w:gridCol w:w="3200"/>
+        <w:gridCol w:w="5800"/>
+      </w:tblGrid>
+      <w:tr>
+        <w:tc>
+          <w:tcPr>
+            <w:tcW w:type="dxa" w:w="3200"/>
+            <w:shd w:fill="F2F2F2" w:val="clear"/>
+          </w:tcPr>
+          <w:p>
+            <w:r>
+              <w:rPr>
+                <w:b/>
+                <w:bCs/>
+              </w:rPr>
+              <w:t xml:space="preserve">Assessment</w:t>
+            </w:r>
+          </w:p>
+        </w:tc>
+        <w:tc>
+          <w:tcPr>
+            <w:tcW w:type="dxa" w:w="5800"/>
+          </w:tcPr>
+          <w:p>
+            <w:r>
+              <w:t xml:space="preserve">neutral</w:t>
+            </w:r>
+          </w:p>
+        </w:tc>
+      </w:tr>
+      <w:tr>
+        <w:tc>
+          <w:tcPr>
+            <w:tcW w:type="dxa" w:w="3200"/>
+            <w:shd w:fill="F2F2F2" w:val="clear"/>
+          </w:tcPr>
+          <w:p>
+            <w:r>
+              <w:rPr>
+                <w:b/>
+                <w:bCs/>
+              </w:rPr>
+              <w:t xml:space="preserve">Capital allocation</w:t>
+            </w:r>
+          </w:p>
+        </w:tc>
+        <w:tc>
+          <w:tcPr>
+            <w:tcW w:type="dxa" w:w="5800"/>
+          </w:tcPr>
+          <w:p>
+            <w:r>
+              <w:t xml:space="preserve">FY26 reinvested at 6.7% ROCE (very low). FY27-28 capex is a directional bet on AI/fiber demand (capital going to expansion, not buyback/dividend). Agarwal group's broader capital-allocation record (Vedanta, HZL, Cairn) is mixed: some value creation, but also serial dilution and sub-scale acquisitions. (neutral)</w:t>
+            </w:r>
+          </w:p>
+        </w:tc>
+      </w:tr>
+      <w:tr>
+        <w:tc>
+          <w:tcPr>
+            <w:tcW w:type="dxa" w:w="3200"/>
+            <w:shd w:fill="F2F2F2" w:val="clear"/>
+          </w:tcPr>
+          <w:p>
+            <w:r>
+              <w:rPr>
+                <w:b/>
+                <w:bCs/>
+              </w:rPr>
+              <w:t xml:space="preserve">Related-party trend</w:t>
+            </w:r>
+          </w:p>
+        </w:tc>
+        <w:tc>
+          <w:tcPr>
+            <w:tcW w:type="dxa" w:w="5800"/>
+          </w:tcPr>
+          <w:p>
+            <w:r>
+              <w:t xml:space="preserve">flat</w:t>
+            </w:r>
+          </w:p>
+        </w:tc>
+      </w:tr>
+      <w:tr>
+        <w:tc>
+          <w:tcPr>
+            <w:tcW w:type="dxa" w:w="3200"/>
+            <w:shd w:fill="F2F2F2" w:val="clear"/>
+          </w:tcPr>
+          <w:p>
+            <w:r>
+              <w:rPr>
+                <w:b/>
+                <w:bCs/>
+              </w:rPr>
+              <w:t xml:space="preserve">Guidance credibility</w:t>
+            </w:r>
+          </w:p>
+        </w:tc>
+        <w:tc>
+          <w:tcPr>
+            <w:tcW w:type="dxa" w:w="5800"/>
+          </w:tcPr>
+          <w:p>
+            <w:r>
+              <w:t xml:space="preserve">mixed</w:t>
+            </w:r>
+          </w:p>
+        </w:tc>
+      </w:tr>
+      <w:tr>
+        <w:tc>
+          <w:tcPr>
+            <w:tcW w:type="dxa" w:w="3200"/>
+            <w:shd w:fill="F2F2F2" w:val="clear"/>
+          </w:tcPr>
+          <w:p>
+            <w:r>
+              <w:rPr>
+                <w:b/>
+                <w:bCs/>
+              </w:rPr>
+              <w:t xml:space="preserve">Shareholder returns</w:t>
+            </w:r>
+          </w:p>
+        </w:tc>
+        <w:tc>
+          <w:tcPr>
+            <w:tcW w:type="dxa" w:w="5800"/>
+          </w:tcPr>
+          <w:p>
+            <w:r>
+              <w:t xml:space="preserve">none</w:t>
+            </w:r>
+          </w:p>
+        </w:tc>
+      </w:tr>
+      <w:tr>
+        <w:tc>
+          <w:tcPr>
+            <w:tcW w:type="dxa" w:w="3200"/>
+            <w:shd w:fill="F2F2F2" w:val="clear"/>
+          </w:tcPr>
+          <w:p>
+            <w:r>
+              <w:rPr>
+                <w:b/>
+                <w:bCs/>
+              </w:rPr>
+              <w:t xml:space="preserve">Capability ladder / VAP</w:t>
+            </w:r>
+          </w:p>
+        </w:tc>
+        <w:tc>
+          <w:tcPr>
+            <w:tcW w:type="dxa" w:w="5800"/>
+          </w:tcPr>
+          <w:p>
+            <w:r>
+              <w:t xml:space="preserve">Backward integration into preform (highest-margin, most-constrained node) is a smart move; execution will determine if STL can sustain a moat vs HFCL/Finolex. No explicit 'moving up the value chain' language, but the capex decision implies this intent.</w:t>
+            </w:r>
+          </w:p>
+        </w:tc>
+      </w:tr>
+    </w:tbl>
+    <w:p>
+      <w:pPr>
+        <w:spacing w:after="120"/>
+      </w:pPr>
+      <w:r>
+        <w:rPr>
+          <w:b/>
+          <w:bCs/>
+          <w:sz w:val="20"/>
+          <w:szCs w:val="20"/>
+        </w:rPr>
+        <w:t xml:space="preserve">Quality metrics (ROCE · debt · FCF · margin · capex):</w:t>
+      </w:r>
+    </w:p>
+    <w:tbl>
+      <w:tblPr>
+        <w:tblW w:type="dxa" w:w="9000"/>
+        <w:tblBorders>
+          <w:top w:val="single" w:color="auto" w:sz="4"/>
+          <w:left w:val="single" w:color="auto" w:sz="4"/>
+          <w:bottom w:val="single" w:color="auto" w:sz="4"/>
+          <w:right w:val="single" w:color="auto" w:sz="4"/>
+          <w:insideH w:val="single" w:color="auto" w:sz="4"/>
+          <w:insideV w:val="single" w:color="auto" w:sz="4"/>
+        </w:tblBorders>
+      </w:tblPr>
+      <w:tblGrid>
+        <w:gridCol w:w="3200"/>
+        <w:gridCol w:w="5800"/>
+      </w:tblGrid>
+      <w:tr>
+        <w:tc>
+          <w:tcPr>
+            <w:tcW w:type="dxa" w:w="3200"/>
+            <w:shd w:fill="F2F2F2" w:val="clear"/>
+          </w:tcPr>
+          <w:p>
+            <w:r>
+              <w:rPr>
+                <w:b/>
+                <w:bCs/>
+              </w:rPr>
+              <w:t xml:space="preserve">Assessment</w:t>
+            </w:r>
+          </w:p>
+        </w:tc>
+        <w:tc>
+          <w:tcPr>
+            <w:tcW w:type="dxa" w:w="5800"/>
+          </w:tcPr>
+          <w:p>
+            <w:r>
+              <w:t xml:space="preserve">concern</w:t>
+            </w:r>
+          </w:p>
+        </w:tc>
+      </w:tr>
+      <w:tr>
+        <w:tc>
+          <w:tcPr>
+            <w:tcW w:type="dxa" w:w="3200"/>
+            <w:shd w:fill="F2F2F2" w:val="clear"/>
+          </w:tcPr>
+          <w:p>
+            <w:r>
+              <w:rPr>
+                <w:b/>
+                <w:bCs/>
+              </w:rPr>
+              <w:t xml:space="preserve">ROCE</w:t>
+            </w:r>
+          </w:p>
+        </w:tc>
+        <w:tc>
+          <w:tcPr>
+            <w:tcW w:type="dxa" w:w="5800"/>
+          </w:tcPr>
+          <w:p>
+            <w:r>
+              <w:t xml:space="preserve">6.7% (improving)</w:t>
+            </w:r>
+          </w:p>
+        </w:tc>
+      </w:tr>
+      <w:tr>
+        <w:tc>
+          <w:tcPr>
+            <w:tcW w:type="dxa" w:w="3200"/>
+            <w:shd w:fill="F2F2F2" w:val="clear"/>
+          </w:tcPr>
+          <w:p>
+            <w:r>
+              <w:rPr>
+                <w:b/>
+                <w:bCs/>
+              </w:rPr>
+              <w:t xml:space="preserve">Leverage</w:t>
+            </w:r>
+          </w:p>
+        </w:tc>
+        <w:tc>
+          <w:tcPr>
+            <w:tcW w:type="dxa" w:w="5800"/>
+          </w:tcPr>
+          <w:p>
+            <w:r>
+              <w:t xml:space="preserve">Net debt/EBITDA -0.6x</w:t>
+            </w:r>
+          </w:p>
+        </w:tc>
+      </w:tr>
+      <w:tr>
+        <w:tc>
+          <w:tcPr>
+            <w:tcW w:type="dxa" w:w="3200"/>
+            <w:shd w:fill="F2F2F2" w:val="clear"/>
+          </w:tcPr>
+          <w:p>
+            <w:r>
+              <w:rPr>
+                <w:b/>
+                <w:bCs/>
+              </w:rPr>
+              <w:t xml:space="preserve">FCF conversion</w:t>
+            </w:r>
+          </w:p>
+        </w:tc>
+        <w:tc>
+          <w:tcPr>
+            <w:tcW w:type="dxa" w:w="5800"/>
+          </w:tcPr>
+          <w:p>
+            <w:r>
+              <w:t xml:space="preserve">-35%</w:t>
+            </w:r>
+          </w:p>
+        </w:tc>
+      </w:tr>
+      <w:tr>
+        <w:tc>
+          <w:tcPr>
+            <w:tcW w:type="dxa" w:w="3200"/>
+            <w:shd w:fill="F2F2F2" w:val="clear"/>
+          </w:tcPr>
+          <w:p>
+            <w:r>
+              <w:rPr>
+                <w:b/>
+                <w:bCs/>
+              </w:rPr>
+              <w:t xml:space="preserve">Margin trend</w:t>
+            </w:r>
+          </w:p>
+        </w:tc>
+        <w:tc>
+          <w:tcPr>
+            <w:tcW w:type="dxa" w:w="5800"/>
+          </w:tcPr>
+          <w:p>
+            <w:r>
+              <w:t xml:space="preserve">expanding</w:t>
+            </w:r>
+          </w:p>
+        </w:tc>
+      </w:tr>
+      <w:tr>
+        <w:tc>
+          <w:tcPr>
+            <w:tcW w:type="dxa" w:w="3200"/>
+            <w:shd w:fill="F2F2F2" w:val="clear"/>
+          </w:tcPr>
+          <w:p>
+            <w:r>
+              <w:rPr>
+                <w:b/>
+                <w:bCs/>
+              </w:rPr>
+              <w:t xml:space="preserve">Capex efficiency</w:t>
+            </w:r>
+          </w:p>
+        </w:tc>
+        <w:tc>
+          <w:tcPr>
+            <w:tcW w:type="dxa" w:w="5800"/>
+          </w:tcPr>
+          <w:p>
+            <w:r>
+              <w:t xml:space="preserve">unclear</w:t>
+            </w:r>
+          </w:p>
+        </w:tc>
+      </w:tr>
+    </w:tbl>
+    <w:p>
+      <w:pPr>
+        <w:spacing w:after="60" w:before="120"/>
+      </w:pPr>
+      <w:r>
+        <w:rPr>
+          <w:b/>
+          <w:bCs/>
+          <w:sz w:val="20"/>
+          <w:szCs w:val="20"/>
+        </w:rPr>
+        <w:t xml:space="preserve">Track record (Coffee Can persistence check): </w:t>
+      </w:r>
+      <w:r>
+        <w:rPr>
+          <w:sz w:val="20"/>
+          <w:szCs w:val="20"/>
+        </w:rPr>
+        <w:t xml:space="preserve">cleared revenue growth ≥10% AND ROCE ≥15% in 0 of the last 3 years (consistency_score 0)</w:t>
+      </w:r>
+    </w:p>
+    <w:p>
+      <w:pPr>
+        <w:spacing w:after="120"/>
+      </w:pPr>
+      <w:r>
+        <w:rPr>
+          <w:color w:val="666666"/>
+          <w:sz w:val="18"/>
+          <w:szCs w:val="18"/>
+        </w:rPr>
+        <w:t xml:space="preserve">FY24/FY25/FY26: None of the last 3 years met BOTH revenue growth ≥10% AND ROCE ≥15%. FY24 had ROCE 4.5% (below 15%), negative growth. FY25 ROCE negative. FY26 ROCE 6.7% (below 15%), revenue +11.8% (cleared growth). FY23 (now 3y ago) had ROCE 26.5% and revenue +30% — cleared; but that was a peak before the multi-year decline. Track record shows a distressed turnaround, not a consistent Cash-Can compounder. Consistency score should be low unless recent inflection sustained 2-3y.</w:t>
+      </w:r>
+    </w:p>
+    <w:p>
+      <w:pPr>
+        <w:pStyle w:val="Heading1"/>
+        <w:spacing w:after="120" w:before="280"/>
+      </w:pPr>
+      <w:r>
+        <w:t xml:space="preserve">Technical Read (Weekly / Monthly MACD + Bollinger Bands, or RSI/CCI/Williams %R proxy)</w:t>
+      </w:r>
+    </w:p>
+    <w:p>
+      <w:pPr>
+        <w:spacing w:after="120"/>
+      </w:pPr>
+      <w:r>
+        <w:t xml:space="preserve">Not assessed.</w:t>
+      </w:r>
+    </w:p>
+    <w:p>
+      <w:pPr>
+        <w:pStyle w:val="Heading1"/>
+        <w:spacing w:after="120" w:before="280"/>
+      </w:pPr>
+      <w:r>
+        <w:t xml:space="preserve">ValuePickr Community Signal</w:t>
+      </w:r>
+    </w:p>
+    <w:p>
+      <w:pPr>
+        <w:spacing w:after="120"/>
+      </w:pPr>
+      <w:r>
+        <w:t xml:space="preserve">Active thread, sharply split. Bulls (AKJInv, Hemant_Dujari) anchor on global leaders YOFC and Corning (both ~Rs 20 lakh Cr mcap) and a multi-year AI infra cycle with STL at only ~3% global share; mgmt's new FY29 guidance (Rs 20,000 Cr rev / Rs 5,400 Cr EBITDA) is called 'mind blowing'. Cautious voices (karanshah137 booked half after a 107% gain; Prabhat_Mohanty distrusts the Agarwal group's capital-markets record across Vedanta/HZL/Cairn) flag the parabolic move, repeated dilution and no margin of safety.</w:t>
+      </w:r>
+    </w:p>
+    <w:p>
+      <w:pPr>
+        <w:spacing w:after="120"/>
+      </w:pPr>
+      <w:r>
+        <w:rPr>
+          <w:b/>
+          <w:bCs/>
+          <w:sz w:val="20"/>
+          <w:szCs w:val="20"/>
+        </w:rPr>
+        <w:t xml:space="preserve">High-conviction call from a top contributor: </w:t>
+      </w:r>
+      <w:r>
+        <w:rPr>
+          <w:sz w:val="20"/>
+          <w:szCs w:val="20"/>
+        </w:rPr>
+        <w:t xml:space="preserve">Trusted-roster users karanshah137 and Aman_Jain3 are both explicitly cautious at current levels — a trusted-user risk flag, not a buy call. No trusted-user high-conviction long.</w:t>
+      </w:r>
+    </w:p>
+    <w:p>
+      <w:pPr>
+        <w:pStyle w:val="Heading1"/>
+        <w:spacing w:after="120" w:before="280"/>
+      </w:pPr>
+      <w:r>
+        <w:t xml:space="preserve">Trusted-User Signals (Ongoing)</w:t>
+      </w:r>
+    </w:p>
+    <w:p>
+      <w:pPr>
+        <w:spacing w:after="120"/>
+      </w:pPr>
       <w:r>
         <w:rPr>
           <w:i/>
@@ -608,15 +2467,7 @@
           <w:sz w:val="18"/>
           <w:szCs w:val="18"/>
         </w:rPr>
-        <w:t xml:space="preserve"/>
-      </w:r>
-      <w:r>
-        <w:rPr>
-          <w:sz w:val="20"/>
-          <w:szCs w:val="20"/>
-        </w:rPr>
-        <w:br/>
-        <w:t xml:space="preserve">: undefined</w:t>
+        <w:t xml:space="preserve">Every time a trusted user expresses clear conviction on this stock, most recent first — this section accumulates over time, it isn't a one-time snapshot.</w:t>
       </w:r>
     </w:p>
     <w:p>
@@ -630,7 +2481,7 @@
           <w:sz w:val="20"/>
           <w:szCs w:val="20"/>
         </w:rPr>
-        <w:t xml:space="preserve">2026-06-05 — undefined</w:t>
+        <w:t xml:space="preserve">2026-04-21 — undefined</w:t>
       </w:r>
       <w:r>
         <w:rPr>
@@ -653,6 +2504,38 @@
     </w:p>
     <w:p>
       <w:pPr>
+        <w:spacing w:after="100"/>
+      </w:pPr>
+      <w:r>
+        <w:rPr>
+          <w:b/>
+          <w:bCs/>
+          <w:sz w:val="20"/>
+          <w:szCs w:val="20"/>
+        </w:rPr>
+        <w:t xml:space="preserve">2026-06-05 — undefined</w:t>
+      </w:r>
+      <w:r>
+        <w:rPr>
+          <w:i/>
+          <w:iCs/>
+          <w:color w:val="666666"/>
+          <w:sz w:val="18"/>
+          <w:szCs w:val="18"/>
+        </w:rPr>
+        <w:t xml:space="preserve"/>
+      </w:r>
+      <w:r>
+        <w:rPr>
+          <w:sz w:val="20"/>
+          <w:szCs w:val="20"/>
+        </w:rPr>
+        <w:br/>
+        <w:t xml:space="preserve">: undefined</w:t>
+      </w:r>
+    </w:p>
+    <w:p>
+      <w:pPr>
         <w:pStyle w:val="Heading1"/>
         <w:spacing w:after="120" w:before="280"/>
       </w:pPr>
@@ -664,7 +2547,9 @@
       <w:pPr>
         <w:spacing w:after="120"/>
       </w:pPr>
-      <w:r/>
+      <w:r>
+        <w:t xml:space="preserve">Not assessed.</w:t>
+      </w:r>
     </w:p>
     <w:p>
       <w:pPr>

</xml_diff>